<commit_message>
Updated help version to 0.9.9
</commit_message>
<xml_diff>
--- a/IDM BUILD_9/Help/Help.docx
+++ b/IDM BUILD_9/Help/Help.docx
@@ -81,8 +81,10 @@
         <w:rPr>
           <w:rFonts w:cs="Times New Roman"/>
         </w:rPr>
-        <w:t>V0.9.8</w:t>
-      </w:r>
+        <w:t>V0.9.9</w:t>
+      </w:r>
+      <w:bookmarkStart w:id="1" w:name="_GoBack"/>
+      <w:bookmarkEnd w:id="1"/>
       <w:r>
         <w:rPr>
           <w:rFonts w:cs="Times New Roman"/>
@@ -164,7 +166,7 @@
         <w:rPr>
           <w:rFonts w:cs="Times New Roman"/>
         </w:rPr>
-        <w:t>5</w:t>
+        <w:t>6</w:t>
       </w:r>
       <w:r>
         <w:rPr>
@@ -217,11 +219,11 @@
         <w:pStyle w:val="Heading1"/>
         <w:framePr w:wrap="notBeside"/>
       </w:pPr>
-      <w:bookmarkStart w:id="1" w:name="_Toc338444602"/>
+      <w:bookmarkStart w:id="2" w:name="_Toc338444602"/>
       <w:r>
         <w:t>Help Content</w:t>
       </w:r>
-      <w:bookmarkEnd w:id="1"/>
+      <w:bookmarkEnd w:id="2"/>
     </w:p>
     <w:p>
       <w:pPr>
@@ -800,13 +802,13 @@
         <w:pStyle w:val="Heading1"/>
         <w:framePr w:wrap="notBeside"/>
       </w:pPr>
-      <w:bookmarkStart w:id="2" w:name="_1._Introduction"/>
-      <w:bookmarkStart w:id="3" w:name="_Toc338444603"/>
-      <w:bookmarkEnd w:id="2"/>
+      <w:bookmarkStart w:id="3" w:name="_1._Introduction"/>
+      <w:bookmarkStart w:id="4" w:name="_Toc338444603"/>
+      <w:bookmarkEnd w:id="3"/>
       <w:r>
         <w:t>1. Introduction</w:t>
       </w:r>
-      <w:bookmarkEnd w:id="3"/>
+      <w:bookmarkEnd w:id="4"/>
       <w:r>
         <w:rPr>
           <w:noProof/>
@@ -911,16 +913,16 @@
         <w:pStyle w:val="Heading1"/>
         <w:framePr w:wrap="notBeside"/>
       </w:pPr>
-      <w:bookmarkStart w:id="4" w:name="_2._Features:"/>
-      <w:bookmarkStart w:id="5" w:name="_Toc338444604"/>
-      <w:bookmarkEnd w:id="4"/>
+      <w:bookmarkStart w:id="5" w:name="_2._Features:"/>
+      <w:bookmarkStart w:id="6" w:name="_Toc338444604"/>
+      <w:bookmarkEnd w:id="5"/>
       <w:r>
         <w:t xml:space="preserve">2. </w:t>
       </w:r>
       <w:r>
         <w:t>Features:</w:t>
       </w:r>
-      <w:bookmarkEnd w:id="5"/>
+      <w:bookmarkEnd w:id="6"/>
       <w:r>
         <w:rPr>
           <w:noProof/>
@@ -1011,6 +1013,7 @@
         <w:rPr>
           <w:rFonts w:cs="Times New Roman"/>
         </w:rPr>
+        <w:lastRenderedPageBreak/>
         <w:t xml:space="preserve">Backup Custom elements for Backup like </w:t>
       </w:r>
       <w:r>
@@ -1247,9 +1250,9 @@
         <w:pStyle w:val="Heading1"/>
         <w:framePr w:wrap="notBeside"/>
       </w:pPr>
-      <w:bookmarkStart w:id="6" w:name="_3._System_Requirement:"/>
-      <w:bookmarkStart w:id="7" w:name="_Toc338444605"/>
-      <w:bookmarkEnd w:id="6"/>
+      <w:bookmarkStart w:id="7" w:name="_3._System_Requirement:"/>
+      <w:bookmarkStart w:id="8" w:name="_Toc338444605"/>
+      <w:bookmarkEnd w:id="7"/>
       <w:r>
         <w:t>3. System</w:t>
       </w:r>
@@ -1259,7 +1262,7 @@
       <w:r>
         <w:t>Requirement:</w:t>
       </w:r>
-      <w:bookmarkEnd w:id="7"/>
+      <w:bookmarkEnd w:id="8"/>
       <w:r>
         <w:rPr>
           <w:noProof/>
@@ -1432,16 +1435,16 @@
         <w:pStyle w:val="Heading1"/>
         <w:framePr w:wrap="notBeside"/>
       </w:pPr>
-      <w:bookmarkStart w:id="8" w:name="_4._Using_IDM"/>
-      <w:bookmarkStart w:id="9" w:name="_Toc338444606"/>
-      <w:bookmarkEnd w:id="8"/>
+      <w:bookmarkStart w:id="9" w:name="_4._Using_IDM"/>
+      <w:bookmarkStart w:id="10" w:name="_Toc338444606"/>
+      <w:bookmarkEnd w:id="9"/>
       <w:r>
         <w:t>4. Using</w:t>
       </w:r>
       <w:r>
         <w:t xml:space="preserve"> IDM Backup Manager</w:t>
       </w:r>
-      <w:bookmarkEnd w:id="9"/>
+      <w:bookmarkEnd w:id="10"/>
       <w:r>
         <w:rPr>
           <w:noProof/>
@@ -1490,11 +1493,11 @@
       <w:pPr>
         <w:pStyle w:val="Heading2"/>
       </w:pPr>
-      <w:bookmarkStart w:id="10" w:name="_(a)_Backing_up"/>
-      <w:bookmarkStart w:id="11" w:name="_4.1_Backing_up"/>
-      <w:bookmarkStart w:id="12" w:name="_Toc338444607"/>
-      <w:bookmarkEnd w:id="10"/>
+      <w:bookmarkStart w:id="11" w:name="_(a)_Backing_up"/>
+      <w:bookmarkStart w:id="12" w:name="_4.1_Backing_up"/>
+      <w:bookmarkStart w:id="13" w:name="_Toc338444607"/>
       <w:bookmarkEnd w:id="11"/>
+      <w:bookmarkEnd w:id="12"/>
       <w:r>
         <w:t>4.1</w:t>
       </w:r>
@@ -1507,17 +1510,17 @@
       <w:r>
         <w:t xml:space="preserve"> IDM</w:t>
       </w:r>
-      <w:bookmarkEnd w:id="12"/>
+      <w:bookmarkEnd w:id="13"/>
     </w:p>
     <w:p>
       <w:pPr>
         <w:pStyle w:val="Heading3"/>
       </w:pPr>
-      <w:bookmarkStart w:id="13" w:name="_(i)_Full_Backup"/>
-      <w:bookmarkStart w:id="14" w:name="_4.1.1_Full_Backup"/>
-      <w:bookmarkStart w:id="15" w:name="_Toc338444608"/>
-      <w:bookmarkEnd w:id="13"/>
+      <w:bookmarkStart w:id="14" w:name="_(i)_Full_Backup"/>
+      <w:bookmarkStart w:id="15" w:name="_4.1.1_Full_Backup"/>
+      <w:bookmarkStart w:id="16" w:name="_Toc338444608"/>
       <w:bookmarkEnd w:id="14"/>
+      <w:bookmarkEnd w:id="15"/>
       <w:r>
         <w:t>4.1.1</w:t>
       </w:r>
@@ -1527,7 +1530,7 @@
       <w:r>
         <w:t>Full Backup</w:t>
       </w:r>
-      <w:bookmarkEnd w:id="15"/>
+      <w:bookmarkEnd w:id="16"/>
     </w:p>
     <w:p>
       <w:pPr>
@@ -1665,6 +1668,7 @@
         <w:rPr>
           <w:rFonts w:cs="Times New Roman"/>
         </w:rPr>
+        <w:lastRenderedPageBreak/>
         <w:t xml:space="preserve">Check Checkbox </w:t>
       </w:r>
       <w:r>
@@ -1754,11 +1758,11 @@
       <w:pPr>
         <w:pStyle w:val="Heading3"/>
       </w:pPr>
-      <w:bookmarkStart w:id="16" w:name="_(ii)_Custom_Backup"/>
-      <w:bookmarkStart w:id="17" w:name="_4.1.2_Custom_Backup"/>
-      <w:bookmarkStart w:id="18" w:name="_Toc338444609"/>
-      <w:bookmarkEnd w:id="16"/>
+      <w:bookmarkStart w:id="17" w:name="_(ii)_Custom_Backup"/>
+      <w:bookmarkStart w:id="18" w:name="_4.1.2_Custom_Backup"/>
+      <w:bookmarkStart w:id="19" w:name="_Toc338444609"/>
       <w:bookmarkEnd w:id="17"/>
+      <w:bookmarkEnd w:id="18"/>
       <w:r>
         <w:t>4.1.2</w:t>
       </w:r>
@@ -1768,7 +1772,7 @@
       <w:r>
         <w:t>Custom Backup</w:t>
       </w:r>
-      <w:bookmarkEnd w:id="18"/>
+      <w:bookmarkEnd w:id="19"/>
     </w:p>
     <w:p>
       <w:pPr>
@@ -1954,18 +1958,18 @@
       <w:pPr>
         <w:pStyle w:val="Heading3"/>
       </w:pPr>
-      <w:bookmarkStart w:id="19" w:name="_(iii)_List_Backup"/>
-      <w:bookmarkStart w:id="20" w:name="_4.1.3_List_Backup"/>
-      <w:bookmarkStart w:id="21" w:name="_Toc338444610"/>
-      <w:bookmarkEnd w:id="19"/>
+      <w:bookmarkStart w:id="20" w:name="_(iii)_List_Backup"/>
+      <w:bookmarkStart w:id="21" w:name="_4.1.3_List_Backup"/>
+      <w:bookmarkStart w:id="22" w:name="_Toc338444610"/>
       <w:bookmarkEnd w:id="20"/>
+      <w:bookmarkEnd w:id="21"/>
       <w:r>
         <w:t>4.1.3</w:t>
       </w:r>
       <w:r>
         <w:t xml:space="preserve"> List Backup</w:t>
       </w:r>
-      <w:bookmarkEnd w:id="21"/>
+      <w:bookmarkEnd w:id="22"/>
     </w:p>
     <w:p>
       <w:pPr>
@@ -2220,11 +2224,11 @@
       <w:pPr>
         <w:pStyle w:val="Heading2"/>
       </w:pPr>
-      <w:bookmarkStart w:id="22" w:name="_(b)_Restoring_IDM"/>
-      <w:bookmarkStart w:id="23" w:name="_4.2_Restoring_IDM"/>
-      <w:bookmarkStart w:id="24" w:name="_Toc338444611"/>
-      <w:bookmarkEnd w:id="22"/>
+      <w:bookmarkStart w:id="23" w:name="_(b)_Restoring_IDM"/>
+      <w:bookmarkStart w:id="24" w:name="_4.2_Restoring_IDM"/>
+      <w:bookmarkStart w:id="25" w:name="_Toc338444611"/>
       <w:bookmarkEnd w:id="23"/>
+      <w:bookmarkEnd w:id="24"/>
       <w:r>
         <w:t>4.2</w:t>
       </w:r>
@@ -2234,7 +2238,7 @@
       <w:r>
         <w:t>Restoring IDM</w:t>
       </w:r>
-      <w:bookmarkEnd w:id="24"/>
+      <w:bookmarkEnd w:id="25"/>
     </w:p>
     <w:p>
       <w:pPr>
@@ -2262,6 +2266,7 @@
           <w:noProof/>
           <w:lang w:bidi="ar-SA"/>
         </w:rPr>
+        <w:lastRenderedPageBreak/>
         <w:drawing>
           <wp:inline distT="0" distB="0" distL="0" distR="0" wp14:anchorId="397EB314" wp14:editId="4CA8CD39">
             <wp:extent cx="4334256" cy="2990088"/>
@@ -2512,11 +2517,11 @@
       <w:pPr>
         <w:pStyle w:val="Heading2"/>
       </w:pPr>
-      <w:bookmarkStart w:id="25" w:name="_(c)_IDM_List"/>
-      <w:bookmarkStart w:id="26" w:name="_4.3_IDM_List"/>
-      <w:bookmarkStart w:id="27" w:name="_Toc338444612"/>
-      <w:bookmarkEnd w:id="25"/>
+      <w:bookmarkStart w:id="26" w:name="_(c)_IDM_List"/>
+      <w:bookmarkStart w:id="27" w:name="_4.3_IDM_List"/>
+      <w:bookmarkStart w:id="28" w:name="_Toc338444612"/>
       <w:bookmarkEnd w:id="26"/>
+      <w:bookmarkEnd w:id="27"/>
       <w:r>
         <w:t>4.3</w:t>
       </w:r>
@@ -2526,7 +2531,7 @@
       <w:r>
         <w:t>IDM List Manager</w:t>
       </w:r>
-      <w:bookmarkEnd w:id="27"/>
+      <w:bookmarkEnd w:id="28"/>
     </w:p>
     <w:p>
       <w:pPr>
@@ -2683,11 +2688,11 @@
       <w:pPr>
         <w:pStyle w:val="Heading3"/>
       </w:pPr>
-      <w:bookmarkStart w:id="28" w:name="_(i)_Analyzing_the"/>
-      <w:bookmarkStart w:id="29" w:name="_4.3.1_Analyzing_the"/>
-      <w:bookmarkStart w:id="30" w:name="_Toc338444613"/>
-      <w:bookmarkEnd w:id="28"/>
+      <w:bookmarkStart w:id="29" w:name="_(i)_Analyzing_the"/>
+      <w:bookmarkStart w:id="30" w:name="_4.3.1_Analyzing_the"/>
+      <w:bookmarkStart w:id="31" w:name="_Toc338444613"/>
       <w:bookmarkEnd w:id="29"/>
+      <w:bookmarkEnd w:id="30"/>
       <w:r>
         <w:t>4.3.1</w:t>
       </w:r>
@@ -2703,7 +2708,7 @@
       <w:r>
         <w:t xml:space="preserve"> File</w:t>
       </w:r>
-      <w:bookmarkEnd w:id="30"/>
+      <w:bookmarkEnd w:id="31"/>
     </w:p>
     <w:p>
       <w:pPr>
@@ -2815,6 +2820,7 @@
         <w:rPr>
           <w:rFonts w:cs="Times New Roman"/>
         </w:rPr>
+        <w:lastRenderedPageBreak/>
         <w:t>List According To Download:</w:t>
       </w:r>
     </w:p>
@@ -3038,11 +3044,11 @@
       <w:pPr>
         <w:pStyle w:val="Heading3"/>
       </w:pPr>
-      <w:bookmarkStart w:id="31" w:name="_(ii)_Joining_File"/>
-      <w:bookmarkStart w:id="32" w:name="_4.3.2_Joining_FILE"/>
-      <w:bookmarkStart w:id="33" w:name="_Toc338444614"/>
-      <w:bookmarkEnd w:id="31"/>
+      <w:bookmarkStart w:id="32" w:name="_(ii)_Joining_File"/>
+      <w:bookmarkStart w:id="33" w:name="_4.3.2_Joining_FILE"/>
+      <w:bookmarkStart w:id="34" w:name="_Toc338444614"/>
       <w:bookmarkEnd w:id="32"/>
+      <w:bookmarkEnd w:id="33"/>
       <w:r>
         <w:t>4.3.2</w:t>
       </w:r>
@@ -3052,7 +3058,7 @@
       <w:r>
         <w:t xml:space="preserve">Joining </w:t>
       </w:r>
-      <w:bookmarkEnd w:id="33"/>
+      <w:bookmarkEnd w:id="34"/>
       <w:r>
         <w:t>FILE (</w:t>
       </w:r>
@@ -3250,11 +3256,11 @@
       <w:pPr>
         <w:pStyle w:val="Heading3"/>
       </w:pPr>
-      <w:bookmarkStart w:id="34" w:name="_(iii)_Removing_File"/>
-      <w:bookmarkStart w:id="35" w:name="_4.3.3_Removing_File"/>
-      <w:bookmarkStart w:id="36" w:name="_Toc338444615"/>
-      <w:bookmarkEnd w:id="34"/>
+      <w:bookmarkStart w:id="35" w:name="_(iii)_Removing_File"/>
+      <w:bookmarkStart w:id="36" w:name="_4.3.3_Removing_File"/>
+      <w:bookmarkStart w:id="37" w:name="_Toc338444615"/>
       <w:bookmarkEnd w:id="35"/>
+      <w:bookmarkEnd w:id="36"/>
       <w:r>
         <w:t>4.3.3</w:t>
       </w:r>
@@ -3264,7 +3270,7 @@
       <w:r>
         <w:t>Removing File</w:t>
       </w:r>
-      <w:bookmarkEnd w:id="36"/>
+      <w:bookmarkEnd w:id="37"/>
     </w:p>
     <w:p>
       <w:pPr>
@@ -3309,11 +3315,11 @@
       <w:pPr>
         <w:pStyle w:val="Heading3"/>
       </w:pPr>
-      <w:bookmarkStart w:id="37" w:name="_(iv)_Exporting_List"/>
-      <w:bookmarkStart w:id="38" w:name="_4.3.4_Exporting_List"/>
-      <w:bookmarkStart w:id="39" w:name="_Toc338444616"/>
-      <w:bookmarkEnd w:id="37"/>
+      <w:bookmarkStart w:id="38" w:name="_(iv)_Exporting_List"/>
+      <w:bookmarkStart w:id="39" w:name="_4.3.4_Exporting_List"/>
+      <w:bookmarkStart w:id="40" w:name="_Toc338444616"/>
       <w:bookmarkEnd w:id="38"/>
+      <w:bookmarkEnd w:id="39"/>
       <w:r>
         <w:t>4.3.4</w:t>
       </w:r>
@@ -3323,7 +3329,7 @@
       <w:r>
         <w:t xml:space="preserve"> List</w:t>
       </w:r>
-      <w:bookmarkEnd w:id="39"/>
+      <w:bookmarkEnd w:id="40"/>
     </w:p>
     <w:p>
       <w:pPr>
@@ -3423,8 +3429,6 @@
           </wp:inline>
         </w:drawing>
       </w:r>
-      <w:bookmarkStart w:id="40" w:name="_GoBack"/>
-      <w:bookmarkEnd w:id="40"/>
     </w:p>
     <w:p>
       <w:pPr>
@@ -3495,6 +3499,7 @@
         <w:rPr>
           <w:rFonts w:cs="Times New Roman"/>
         </w:rPr>
+        <w:lastRenderedPageBreak/>
         <w:t>To IDM Text File</w:t>
       </w:r>
     </w:p>
@@ -3848,6 +3853,7 @@
         <w:rPr>
           <w:rFonts w:cs="Times New Roman"/>
         </w:rPr>
+        <w:lastRenderedPageBreak/>
         <w:t xml:space="preserve">Go to Tools Menu and run </w:t>
       </w:r>
       <w:r>
@@ -4172,6 +4178,7 @@
           <w:b/>
           <w:bCs/>
         </w:rPr>
+        <w:lastRenderedPageBreak/>
         <w:t>Backup Folder:</w:t>
       </w:r>
       <w:r>
@@ -5488,6 +5495,7 @@
           <w:noProof/>
           <w:lang w:bidi="ar-SA"/>
         </w:rPr>
+        <w:lastRenderedPageBreak/>
         <w:drawing>
           <wp:inline distT="0" distB="0" distL="0" distR="0">
             <wp:extent cx="900113" cy="900113"/>
@@ -9159,7 +9167,7 @@
 </file>
 
 <file path=customXml/itemProps1.xml><?xml version="1.0" encoding="utf-8"?>
-<ds:datastoreItem xmlns:ds="http://schemas.openxmlformats.org/officeDocument/2006/customXml" ds:itemID="{E876A8DA-179E-4D4C-9E17-A17E4D609FBC}">
+<ds:datastoreItem xmlns:ds="http://schemas.openxmlformats.org/officeDocument/2006/customXml" ds:itemID="{88E61836-5943-40EC-82F1-4C2671E5C0FC}">
   <ds:schemaRefs>
     <ds:schemaRef ds:uri="http://schemas.openxmlformats.org/officeDocument/2006/bibliography"/>
   </ds:schemaRefs>

</xml_diff>